<commit_message>
Add chat history feature
</commit_message>
<xml_diff>
--- a/workspace/outputs/EQUIP-001_Maintenance_Approval_Note.docx
+++ b/workspace/outputs/EQUIP-001_Maintenance_Approval_Note.docx
@@ -187,7 +187,7 @@
           </w:tcPr>
           <w:p>
             <w:r>
-              <w:t>2026-09-03 03:10</w:t>
+              <w:t>2026-09-07 21:07</w:t>
             </w:r>
           </w:p>
         </w:tc>
@@ -241,83 +241,8 @@
       </w:r>
     </w:p>
     <w:p>
-      <w:pPr>
-        <w:pStyle w:val="ListBullet"/>
-      </w:pPr>
       <w:r>
-        <w:rPr>
-          <w:b/>
-        </w:rPr>
-        <w:t>maintenance_sop.pdf — Page 2</w:t>
-      </w:r>
-    </w:p>
-    <w:p>
-      <w:r>
-        <w:t xml:space="preserve">   "Step 12: Run-in period: 2 hours at 50% load, monitor temperature and vibration 4. MECHANICAL SEAL MAINTENANCE -------------------------------- Section 4.1 - Seal Inspection Inspect for: leakage, heat ..."</w:t>
-      </w:r>
-    </w:p>
-    <w:p>
-      <w:pPr>
-        <w:pStyle w:val="ListBullet"/>
-      </w:pPr>
-      <w:r>
-        <w:rPr>
-          <w:b/>
-        </w:rPr>
-        <w:t>maintenance_sop.pdf — Page 1</w:t>
-      </w:r>
-    </w:p>
-    <w:p>
-      <w:r>
-        <w:t xml:space="preserve">   "MAINTENANCE STANDARD OPERATING PROCEDURE ========================================= [FICTIONAL/DEMO DOCUMENT - NOT REAL PROCEDURE] Document No: SOP-MECH-042 (FICTIONAL) Title: Centrifugal Pump Maintena..."</w:t>
-      </w:r>
-    </w:p>
-    <w:p>
-      <w:pPr>
-        <w:pStyle w:val="ListBullet"/>
-      </w:pPr>
-      <w:r>
-        <w:rPr>
-          <w:b/>
-        </w:rPr>
-        <w:t>inspection_report.pdf — Page 2</w:t>
-      </w:r>
-    </w:p>
-    <w:p>
-      <w:r>
-        <w:t xml:space="preserve">   "Rated differential pressure: 16.0 bar Status: SLIGHTLY BELOW RATED - Acceptable 5. NOISE - ABNORMAL Unusual metallic noise detected at non-drive end bearing Possible causes: Bearing wear, cavitation, ..."</w:t>
-      </w:r>
-    </w:p>
-    <w:p>
-      <w:pPr>
-        <w:pStyle w:val="ListBullet"/>
-      </w:pPr>
-      <w:r>
-        <w:rPr>
-          <w:b/>
-        </w:rPr>
-        <w:t>safety_manual.pdf — Page 1</w:t>
-      </w:r>
-    </w:p>
-    <w:p>
-      <w:r>
-        <w:t xml:space="preserve">   "PLANT SAFETY MANUAL - SECTION 7: ROTATING EQUIPMENT ===================================================== [FICTIONAL/DEMO DOCUMENT] Document: HSE-MAN-007 (FICTIONAL) Revision: 2 Date: 2024-03-01 7.1 R..."</w:t>
-      </w:r>
-    </w:p>
-    <w:p>
-      <w:pPr>
-        <w:pStyle w:val="ListBullet"/>
-      </w:pPr>
-      <w:r>
-        <w:rPr>
-          <w:b/>
-        </w:rPr>
-        <w:t>inspection_report.pdf — Page 1</w:t>
-      </w:r>
-    </w:p>
-    <w:p>
-      <w:r>
-        <w:t xml:space="preserve">   "INSPECTION REPORT ================= [FICTIONAL/DEMO DATA - NOT REAL EQUIPMENT] Organization: DEMO Refinery Corporation (FICTIONAL) Plant / Unit: Crude Distillation Unit (CDU) - DEMO Report No: IR-2024..."</w:t>
+        <w:t>No SOP references retrieved. Manual SOP lookup recommended.</w:t>
       </w:r>
     </w:p>
     <w:p>
@@ -343,24 +268,7 @@
     </w:p>
     <w:p>
       <w:r>
-        <w:t xml:space="preserve">### Maintenance Assessment for P-104 Centrifugal Pump  </w:t>
-        <w:br/>
-        <w:br/>
-        <w:t xml:space="preserve">**1. Severity**: Critical  </w:t>
-        <w:br/>
-        <w:t xml:space="preserve">*(Rationale: Active bearing noise indicates imminent failure risk; coupling wear is at end-of-life threshold)*  </w:t>
-        <w:br/>
-        <w:br/>
-        <w:t xml:space="preserve">**2. Key Risks if Not Addressed**:  </w:t>
-        <w:br/>
-        <w:t xml:space="preserve">- **Bearing failure** → Pump seizure, fluid release, or safety hazard (pressure escalation).  </w:t>
-        <w:br/>
-        <w:t xml:space="preserve">- **Coupling failure** → Misalignment, mechanical damage, or unplanned shutdown within 3–6 months.  </w:t>
-        <w:br/>
-        <w:br/>
-        <w:t xml:space="preserve">**3. Specific Recommended Action**:  </w:t>
-        <w:br/>
-        <w:t>- **Immediately inspect non-drive end bearing** for wear/cavitation (per SOP Step 12 run-in protocol).</w:t>
+        <w:t>Detailed inspection and maintenance by qualified engineer.</w:t>
       </w:r>
     </w:p>
     <w:p>
@@ -687,7 +595,7 @@
           </w:tcPr>
           <w:p>
             <w:r>
-              <w:t>LOCAL — 5 sources retrieved</w:t>
+              <w:t>LOCAL — 0 sources retrieved</w:t>
             </w:r>
           </w:p>
         </w:tc>
@@ -731,7 +639,7 @@
           </w:tcPr>
           <w:p>
             <w:r>
-              <w:t>2026-09-03T03:10:51.225035</w:t>
+              <w:t>2026-09-07T21:07:04.580749</w:t>
             </w:r>
           </w:p>
         </w:tc>
@@ -787,7 +695,7 @@
       <w:jc w:val="center"/>
     </w:pPr>
     <w:r>
-      <w:t>SIH26117 Sovereign AI Workbench | Generated: 2026-09-03 03:10 | LOCAL | DRAFT — HUMAN REVIEW REQUIRED</w:t>
+      <w:t>SIH26117 Sovereign AI Workbench | Generated: 2026-09-07 21:07 | LOCAL | DRAFT — HUMAN REVIEW REQUIRED</w:t>
     </w:r>
   </w:p>
 </w:ftr>

</xml_diff>